<commit_message>
docs: add EU legal & compliance phase to live-API roadmap
New Phase 5 (cookie consent, imprint/privacy/terms pages, email unsubscribe +
List-Unsubscribe, affiliate disclosure near CTAs, per-market notes for EU/UK/CH)
built to the strictest DE/AT standard and translated per market. Reference and
"how this differs" sections renumbered. Points to the partner's detailed spec on
branch docs/spec-compilation-2026-06-23.

Co-Authored-By: Claude Opus 4.8 <noreply@anthropic.com>
</commit_message>
<xml_diff>
--- a/docs/LIVE_API_ROADMAP.docx
+++ b/docs/LIVE_API_ROADMAP.docx
@@ -20,7 +20,7 @@
           <w:color w:val="555555"/>
           <w:sz w:val="20"/>
         </w:rPr>
-        <w:t xml:space="preserve">Internal roadmap for moving DealRadar from synthetic (mock) data to live affiliate APIs, then to monetisation and growth. Adapted to the real codebase — file paths, types, and the provider architecture that already exists. Last reviewed: 2026-06-23.</w:t>
+        <w:t xml:space="preserve">Internal roadmap for moving DealRadar from synthetic (mock) data to live affiliate APIs, then to monetisation and growth. Adapted to the real codebase — file paths, types, and the provider architecture that already exists. A more detailed spec for the live-API + compliance phase lives on branch docs/spec-compilation-2026-06-23. Last reviewed: 2026-06-24.</w:t>
       </w:r>
     </w:p>
     <w:p>
@@ -662,7 +662,15 @@
         <w:pStyle w:val="Heading1"/>
       </w:pPr>
       <w:r>
-        <w:t xml:space="preserve">5. Reference — EMEA affiliate networks &amp; aggregators</w:t>
+        <w:t xml:space="preserve">5. Phase 5 — EU legal &amp; compliance</w:t>
+      </w:r>
+    </w:p>
+    <w:p>
+      <w:pPr>
+        <w:spacing w:after="120"/>
+      </w:pPr>
+      <w:r>
+        <w:t xml:space="preserve">Required before driving real traffic — Germany especially. It is EU-wide law, so build it ONCE to the strictest (DE/AT) standard and TRANSLATE per market — not a separate setup per country. UK and Switzerland need small tweaks. Not legal advice; have a lawyer review before launch.</w:t>
       </w:r>
     </w:p>
     <w:p>
@@ -670,6 +678,264 @@
         <w:pStyle w:val="Heading2"/>
       </w:pPr>
       <w:r>
+        <w:t xml:space="preserve">5.1 Cookie consent banner</w:t>
+      </w:r>
+    </w:p>
+    <w:p>
+      <w:pPr>
+        <w:spacing w:after="60"/>
+        <w:ind w:left="360" w:hanging="360"/>
+      </w:pPr>
+      <w:r>
+        <w:t xml:space="preserve">•</w:t>
+      </w:r>
+      <w:r>
+        <w:tab/>
+      </w:r>
+      <w:r>
+        <w:rPr>
+          <w:b/>
+        </w:rPr>
+        <w:t xml:space="preserve">Build — </w:t>
+      </w:r>
+      <w:r>
+        <w:t xml:space="preserve">A banner that blocks all non-essential cookies/scripts until the user opts in (GDPR + ePrivacy + German TTDSG). E.g. the FOSS vanilla-cookieconsent. Categories: necessary (always on) vs analytics/marketing (opt-in); store the choice and respect it before loading anything non-essential.</w:t>
+      </w:r>
+    </w:p>
+    <w:p>
+      <w:pPr>
+        <w:pStyle w:val="Heading2"/>
+      </w:pPr>
+      <w:r>
+        <w:t xml:space="preserve">5.2 Legal pages (one set, translated)</w:t>
+      </w:r>
+    </w:p>
+    <w:p>
+      <w:pPr>
+        <w:spacing w:after="60"/>
+        <w:ind w:left="360" w:hanging="360"/>
+      </w:pPr>
+      <w:r>
+        <w:t xml:space="preserve">•</w:t>
+      </w:r>
+      <w:r>
+        <w:tab/>
+      </w:r>
+      <w:r>
+        <w:rPr>
+          <w:b/>
+        </w:rPr>
+        <w:t xml:space="preserve">Imprint — </w:t>
+      </w:r>
+      <w:r>
+        <w:t xml:space="preserve">Imprint / “Impressum”: company name, address, contact, registration + VAT id. The German/Austrian Impressumspflicht is the strictest — meet it and the rest of the EU is covered.</w:t>
+      </w:r>
+    </w:p>
+    <w:p>
+      <w:pPr>
+        <w:spacing w:after="60"/>
+        <w:ind w:left="360" w:hanging="360"/>
+      </w:pPr>
+      <w:r>
+        <w:t xml:space="preserve">•</w:t>
+      </w:r>
+      <w:r>
+        <w:tab/>
+      </w:r>
+      <w:r>
+        <w:rPr>
+          <w:b/>
+        </w:rPr>
+        <w:t xml:space="preserve">Privacy — </w:t>
+      </w:r>
+      <w:r>
+        <w:t xml:space="preserve">Privacy policy: what data you collect, why, legal basis, third parties (affiliate networks, Resend, Supabase), user rights, contact.</w:t>
+      </w:r>
+    </w:p>
+    <w:p>
+      <w:pPr>
+        <w:spacing w:after="60"/>
+        <w:ind w:left="360" w:hanging="360"/>
+      </w:pPr>
+      <w:r>
+        <w:t xml:space="preserve">•</w:t>
+      </w:r>
+      <w:r>
+        <w:tab/>
+      </w:r>
+      <w:r>
+        <w:rPr>
+          <w:b/>
+        </w:rPr>
+        <w:t xml:space="preserve">Terms — </w:t>
+      </w:r>
+      <w:r>
+        <w:t xml:space="preserve">Terms of service + the affiliate-relationship disclosure. Add localised routes, e.g. src/app/[locale]/legal/{imprint,privacy,terms}/page.tsx.</w:t>
+      </w:r>
+    </w:p>
+    <w:p>
+      <w:pPr>
+        <w:pStyle w:val="Heading2"/>
+      </w:pPr>
+      <w:r>
+        <w:t xml:space="preserve">5.3 Email compliance (price-drop alerts)</w:t>
+      </w:r>
+    </w:p>
+    <w:p>
+      <w:pPr>
+        <w:spacing w:after="60"/>
+        <w:ind w:left="360" w:hanging="360"/>
+      </w:pPr>
+      <w:r>
+        <w:t xml:space="preserve">•</w:t>
+      </w:r>
+      <w:r>
+        <w:tab/>
+      </w:r>
+      <w:r>
+        <w:rPr>
+          <w:b/>
+        </w:rPr>
+        <w:t xml:space="preserve">Unsubscribe — </w:t>
+      </w:r>
+      <w:r>
+        <w:t xml:space="preserve">Every alert email needs a visible unsubscribe link AND a List-Unsubscribe header (RFC 8058) — GDPR Art. 7(3) + German UWG §7. Update priceDropEmail() in alerts.repo.ts and add an unsubscribe route + token.</w:t>
+      </w:r>
+    </w:p>
+    <w:p>
+      <w:pPr>
+        <w:pStyle w:val="Heading2"/>
+      </w:pPr>
+      <w:r>
+        <w:t xml:space="preserve">5.4 Affiliate disclosure near the buttons</w:t>
+      </w:r>
+    </w:p>
+    <w:p>
+      <w:pPr>
+        <w:spacing w:after="60"/>
+        <w:ind w:left="360" w:hanging="360"/>
+      </w:pPr>
+      <w:r>
+        <w:t xml:space="preserve">•</w:t>
+      </w:r>
+      <w:r>
+        <w:tab/>
+      </w:r>
+      <w:r>
+        <w:rPr>
+          <w:b/>
+        </w:rPr>
+        <w:t xml:space="preserve">Disclosure — </w:t>
+      </w:r>
+      <w:r>
+        <w:t xml:space="preserve">Show a short “ad / affiliate link” note next to the outbound “View at” CTAs, not only in the footer — EU Directive 2005/29/EC + German UWG.</w:t>
+      </w:r>
+    </w:p>
+    <w:p>
+      <w:pPr>
+        <w:pStyle w:val="Heading2"/>
+      </w:pPr>
+      <w:r>
+        <w:t xml:space="preserve">5.5 Per-market notes</w:t>
+      </w:r>
+    </w:p>
+    <w:p>
+      <w:pPr>
+        <w:spacing w:after="60"/>
+        <w:ind w:left="360" w:hanging="360"/>
+      </w:pPr>
+      <w:r>
+        <w:t xml:space="preserve">•</w:t>
+      </w:r>
+      <w:r>
+        <w:tab/>
+      </w:r>
+      <w:r>
+        <w:rPr>
+          <w:b/>
+        </w:rPr>
+        <w:t xml:space="preserve">EU + Norway — </w:t>
+      </w:r>
+      <w:r>
+        <w:t xml:space="preserve">EU/EEA (DE, AT, FR, ES, IT, PL, NL, PT, SE, RO, BE, DK, FI, NO): one GDPR-based setup, translated per language.</w:t>
+      </w:r>
+    </w:p>
+    <w:p>
+      <w:pPr>
+        <w:spacing w:after="60"/>
+        <w:ind w:left="360" w:hanging="360"/>
+      </w:pPr>
+      <w:r>
+        <w:t xml:space="preserve">•</w:t>
+      </w:r>
+      <w:r>
+        <w:tab/>
+      </w:r>
+      <w:r>
+        <w:rPr>
+          <w:b/>
+        </w:rPr>
+        <w:t xml:space="preserve">UK — </w:t>
+      </w:r>
+      <w:r>
+        <w:t xml:space="preserve">UK (GB): UK GDPR + PECR — near-identical, minor wording tweaks.</w:t>
+      </w:r>
+    </w:p>
+    <w:p>
+      <w:pPr>
+        <w:spacing w:after="60"/>
+        <w:ind w:left="360" w:hanging="360"/>
+      </w:pPr>
+      <w:r>
+        <w:t xml:space="preserve">•</w:t>
+      </w:r>
+      <w:r>
+        <w:tab/>
+      </w:r>
+      <w:r>
+        <w:rPr>
+          <w:b/>
+        </w:rPr>
+        <w:t xml:space="preserve">Switzerland — </w:t>
+      </w:r>
+      <w:r>
+        <w:t xml:space="preserve">Switzerland (CH): own data-protection law (nFADP) — similar; may need a small addition / EU representative.</w:t>
+      </w:r>
+    </w:p>
+    <w:p>
+      <w:pPr>
+        <w:spacing w:after="60"/>
+        <w:ind w:left="360" w:hanging="360"/>
+      </w:pPr>
+      <w:r>
+        <w:t xml:space="preserve">•</w:t>
+      </w:r>
+      <w:r>
+        <w:tab/>
+      </w:r>
+      <w:r>
+        <w:rPr>
+          <w:b/>
+        </w:rPr>
+        <w:t xml:space="preserve">Caveat — </w:t>
+      </w:r>
+      <w:r>
+        <w:t xml:space="preserve">Germany has aggressive private enforcement (“Abmahnung”) — get it right there first.</w:t>
+      </w:r>
+    </w:p>
+    <w:p>
+      <w:pPr>
+        <w:pStyle w:val="Heading1"/>
+      </w:pPr>
+      <w:r>
+        <w:t xml:space="preserve">6. Reference — EMEA affiliate networks &amp; aggregators</w:t>
+      </w:r>
+    </w:p>
+    <w:p>
+      <w:pPr>
+        <w:pStyle w:val="Heading2"/>
+      </w:pPr>
+      <w:r>
         <w:t xml:space="preserve">Data aggregators (unify many networks into one API)</w:t>
       </w:r>
     </w:p>
@@ -979,7 +1245,7 @@
         <w:pStyle w:val="Heading1"/>
       </w:pPr>
       <w:r>
-        <w:t xml:space="preserve">6. How this differs from the original plan</w:t>
+        <w:t xml:space="preserve">7. How this differs from the original plan</w:t>
       </w:r>
     </w:p>
     <w:p>

</xml_diff>